<commit_message>
Apply the staged Update 102 entry to 01_Project Proposal
The .~lock file for this doc was stale (no LibreOffice process actually
had it open), so the PENDING_Update102.txt sidecar staged in the previous
commit is now pasted in directly and the sidecar removed.

Co-Authored-By: Claude Sonnet 5 <noreply@anthropic.com>
Claude-Session: https://claude.ai/code/session_01SgNvAdfN74Y7zAMFHtH4yC
</commit_message>
<xml_diff>
--- a/docx/01_Project Proposal - Morise Holdings Limited.docx
+++ b/docx/01_Project Proposal - Morise Holdings Limited.docx
@@ -11188,6 +11188,54 @@
       </w:pPr>
       <w:r>
         <w:t>Scope note — the Update 86 alert notifications are now visible on the bell: the dropdown was drawing white text on white inside the navy top bar and now sets its own dark colour. Department routing is deterministic (ordered keywords, most-specific first). No schema, endpoint or permission change.</w:t>
+      </w:r>
+    </w:p>
+    <w:p>
+      <w:pPr>
+        <w:pStyle w:val="Heading1"/>
+      </w:pPr>
+      <w:r>
+        <w:t>100. Implementation Status Update 102 (9 September 2026) — Storefront Language Set Scoped to 9 Official Languages</w:t>
+      </w:r>
+    </w:p>
+    <w:p>
+      <w:pPr>
+        <w:pStyle w:val="BodyText"/>
+      </w:pPr>
+      <w:r>
+        <w:t>An administrator asked for the Customer Storefront to be localised and globalised into a specific, named set of languages, grouped exactly as given: Uganda — Official/Global (English), Uganda — Official/Africa (Kiswahili), Uganda — Bantu (Luganda), Africa (Arabic), Europe (German, French, Spanish, Italian), and The Americas (Portuguese).</w:t>
+      </w:r>
+    </w:p>
+    <w:p>
+      <w:pPr>
+        <w:pStyle w:val="BodyText"/>
+      </w:pPr>
+      <w:r>
+        <w:t>These 9 languages were already shipped fully translated across Updates 29–31 (framework, full key catalogue, database content localisation), inside a much larger 43-language aspirational list added in Update 30 — 34 English-fallback placeholder languages plus two partially-translated regional languages (Runyankole, Acholi). mbms/storefront/src/locales/index.js's LANGUAGE_LIST and LOCALES are now scoped to exactly these 9 official languages, retiring the placeholder and partial entries; every remaining language ships a complete translation, so the picker's “English for now” caveat no longer applies to any option, and TRANSLATED_LANGS now equals FULLY_TRANSLATED_LANGS. The picker's region groups match the administrator's naming exactly.</w:t>
+      </w:r>
+    </w:p>
+    <w:p>
+      <w:pPr>
+        <w:pStyle w:val="BodyText"/>
+      </w:pPr>
+      <w:r>
+        <w:t>Database content localisation (glossary + TranslationProvider seam, Update 32), currency/figure localisation (lib/format.js's CURRENCY_BY_LANG / LOCALE_TAG, Update 33) and digit transliteration already covered exactly this 9-language set and needed no change. No backend, schema, endpoint or permission change — a front-end scope change to an existing feature. Verified end to end: vite build clean (74 modules); the language picker shows exactly 9 options across the administrator's 6 named region groups, all rendering the full storefront (not an English fallback).</w:t>
+      </w:r>
+    </w:p>
+    <w:p>
+      <w:pPr>
+        <w:pStyle w:val="Heading2"/>
+      </w:pPr>
+      <w:r>
+        <w:t>Impact on this document</w:t>
+      </w:r>
+    </w:p>
+    <w:p>
+      <w:pPr>
+        <w:pStyle w:val="BodyText"/>
+      </w:pPr>
+      <w:r>
+        <w:t>Scope note — the Customer Storefront's language offering (Updates 29–31) is now the administrator's exact 9-language set, grouped Uganda — Official/Global, Uganda — Official/Africa, Uganda — Bantu, Africa, Europe, The Americas — not an open-ended aspirational list.</w:t>
       </w:r>
     </w:p>
     <w:sectPr>

</xml_diff>

<commit_message>
Catch up 01_Project Proposal on the Update 88-101 backlog
This doc has been LibreOffice-locked since Update 88, so 14 status-log
sections were staged as PENDING_UpdateN.txt sidecars instead of being
applied directly. With the lock confirmed stale (no LibreOffice process
had it open), all 14 are now pasted in as Heading-1 sections 101-114,
following Update 102 (already applied at position 100). The doc's own
section numbering is position-in-document, not the Update N value, so
these land after 102 in the order they're finally applied rather than
strict Update-N order — consistent with how this doc's numbering has
always worked. All 14 sidecar files are removed.

Co-Authored-By: Claude Sonnet 5 <noreply@anthropic.com>
Claude-Session: https://claude.ai/code/session_01SgNvAdfN74Y7zAMFHtH4yC
</commit_message>
<xml_diff>
--- a/docx/01_Project Proposal - Morise Holdings Limited.docx
+++ b/docx/01_Project Proposal - Morise Holdings Limited.docx
@@ -11236,6 +11236,798 @@
       </w:pPr>
       <w:r>
         <w:t>Scope note — the Customer Storefront's language offering (Updates 29–31) is now the administrator's exact 9-language set, grouped Uganda — Official/Global, Uganda — Official/Africa, Uganda — Bantu, Africa, Europe, The Americas — not an open-ended aspirational list.</w:t>
+      </w:r>
+    </w:p>
+    <w:p>
+      <w:pPr>
+        <w:pStyle w:val="Heading1"/>
+      </w:pPr>
+      <w:r>
+        <w:t>101. Implementation Status Update 88 (2 September 2026) — Social Media Channels Managed From One Shared Record</w:t>
+      </w:r>
+    </w:p>
+    <w:p>
+      <w:pPr>
+        <w:pStyle w:val="BodyText"/>
+      </w:pPr>
+      <w:r>
+        <w:t>An administrator asked to manage the storefront's social media channels from the CMS / Site Builder section of the admin/backend so that a single edit — one handle, one display name, one tagline, one visibility setting — can be pushed to every social media channel at once, and so that adding, updating or deleting all channels is a single click rather than a per-channel chore.</w:t>
+      </w:r>
+    </w:p>
+    <w:p>
+      <w:pPr>
+        <w:pStyle w:val="BodyText"/>
+      </w:pPr>
+      <w:r>
+        <w:t>A new SocialContent table (migration 20260902150000_social_content) holds exactly one row: the shared content record — an account handle, a display name used as the link label on every channel, a tagline shown above the channel row in the storefront footer, and a shared visibility flag. It sits alongside the existing per-channel SocialLink table, which is unchanged, so a channel can still be added or edited individually as before.</w:t>
+      </w:r>
+    </w:p>
+    <w:p>
+      <w:pPr>
+        <w:pStyle w:val="BodyText"/>
+      </w:pPr>
+      <w:r>
+        <w:t>Four endpoints were added under the existing cms.manage / cms.viewAll permissions (no new permission): GET and PUT /api/v1/cms/social-content read and save the shared record; POST /api/v1/cms/social-content/apply pushes it onto every channel in one call — with { createMissing: true } it first creates a channel for every supported platform, building each URL from the shared handle, and with { overwriteUrls: true } it rebuilds every channel URL from that handle; DELETE /api/v1/cms/social-content/channels removes every channel at once. The CMS / Site Builder screen gains a "Shared content — one edit, all channels" panel with Save, "Apply to all channels", "Add &amp; sync every platform" and "Clear all channels" buttons. The storefront footer now shows the shared tagline above the channel icons via a new public GET /api/v1/customer-portal/public/social-content.</w:t>
+      </w:r>
+    </w:p>
+    <w:p>
+      <w:pPr>
+        <w:pStyle w:val="BodyText"/>
+      </w:pPr>
+      <w:r>
+        <w:t>Verified end to end against the running system: saving the shared record then clicking "Add &amp; sync every platform" created the eight buildable platform channels and set every label and visibility from the record; "Apply to all channels" with the URL-rebuild option on rewrote every channel URL from the handle; "Clear all channels" deleted them all and a re-apply with createMissing rebuilt them; the storefront footer read the shared tagline. Every mutation writes an audit event (cms.social_content.updated / applied / cleared). nest build, admin vite build and storefront vite build all clean; openapi.json regenerated (355 paths, 453 operations).</w:t>
+      </w:r>
+    </w:p>
+    <w:p>
+      <w:pPr>
+        <w:pStyle w:val="Heading2"/>
+      </w:pPr>
+      <w:r>
+        <w:t>Impact on this document</w:t>
+      </w:r>
+    </w:p>
+    <w:p>
+      <w:pPr>
+        <w:pStyle w:val="BodyText"/>
+      </w:pPr>
+      <w:r>
+        <w:t>Scope note — this is an administrator-facing convenience on an already-delivered feature (admin-managed social channels, Update recorded earlier): the change is additive (one single-row table, four endpoints on the existing CMS controller, existing permissions) and does not alter the project's scope, phasing, cost basis or architecture position.</w:t>
+      </w:r>
+    </w:p>
+    <w:p>
+      <w:pPr>
+        <w:pStyle w:val="Heading1"/>
+      </w:pPr>
+      <w:r>
+        <w:t>102. Implementation Status Update 89 (2 September 2026) — Every Social Media Platform Managed From One CMS Roster</w:t>
+      </w:r>
+    </w:p>
+    <w:p>
+      <w:pPr>
+        <w:pStyle w:val="BodyText"/>
+      </w:pPr>
+      <w:r>
+        <w:t>Following Update 88 (a shared social-content record with a one-click apply to all channels), an administrator asked that the social media channels be managed from the CMS / Site Builder section as one place that reflects every social media platform — so the panel shows all supported platforms as a fixed list, whether or not a channel row exists yet, rather than only the channels that happen to have been added.</w:t>
+      </w:r>
+    </w:p>
+    <w:p>
+      <w:pPr>
+        <w:pStyle w:val="BodyText"/>
+      </w:pPr>
+      <w:r>
+        <w:t>The CMS / Site Builder "Social media channels" panel is now a fixed roster of every supported platform (Facebook, X, Instagram, LinkedIn, YouTube, TikTok, WhatsApp, Telegram, Other). Each platform is one editable row — URL, label, visibility, order — present at all times; a platform with no URL shows as "not set" with its expected URL shape as a placeholder. Saving a row creates the channel; clearing its URL and saving removes it; the visibility toggle and the up/down order controls act on the platforms that have a row.</w:t>
+      </w:r>
+    </w:p>
+    <w:p>
+      <w:pPr>
+        <w:pStyle w:val="BodyText"/>
+      </w:pPr>
+      <w:r>
+        <w:t>Backing this: the social_links table now has a UNIQUE constraint on platform (migration 20260902160000_social_link_platform_unique — it de-duplicates any existing rows first). Two endpoints were added under the existing cms.manage / cms.viewAll permissions (no new permission): GET /api/v1/cms/social-links/roster returns all nine platforms with any existing row merged in and a URL hint; PUT /api/v1/cms/social-links/platform/:platform creates, updates or (on an explicit empty URL) deletes that platform's single row. The free-form "add a channel" form is replaced by the roster.</w:t>
+      </w:r>
+    </w:p>
+    <w:p>
+      <w:pPr>
+        <w:pStyle w:val="BodyText"/>
+      </w:pPr>
+      <w:r>
+        <w:t>Verified end to end against the running system (roster returns all nine platforms; per-platform create / update / clear-to-delete work; POST /cms/social-links for an existing platform returns a 409). nest build, admin vite build and storefront vite build all clean; prisma migrate deploy applied; openapi.json regenerated (357 paths, 455 operations).</w:t>
+      </w:r>
+    </w:p>
+    <w:p>
+      <w:pPr>
+        <w:pStyle w:val="Heading2"/>
+      </w:pPr>
+      <w:r>
+        <w:t>Impact on this document</w:t>
+      </w:r>
+    </w:p>
+    <w:p>
+      <w:pPr>
+        <w:pStyle w:val="BodyText"/>
+      </w:pPr>
+      <w:r>
+        <w:t>Scope note — an administrator-facing refinement of an already-delivered feature (admin-managed social channels): the CMS panel now enumerates every supported platform. Additive (one UNIQUE constraint with an in-migration de-dupe, two endpoints on the existing CMS controller, existing permissions); no change to project scope, phasing, cost basis or architecture position.</w:t>
+      </w:r>
+    </w:p>
+    <w:p>
+      <w:pPr>
+        <w:pStyle w:val="Heading1"/>
+      </w:pPr>
+      <w:r>
+        <w:t>103. Implementation Status Update 90 (3 September 2026) — Automatic Staff Identification Cards for Active Administration Staff</w:t>
+      </w:r>
+    </w:p>
+    <w:p>
+      <w:pPr>
+        <w:pStyle w:val="BodyText"/>
+      </w:pPr>
+      <w:r>
+        <w:t>An administrator asked that every actively registered administration staff member carry a system-generated staff identification card that is added, updated and issued automatically rather than filled in by hand for each person.</w:t>
+      </w:r>
+    </w:p>
+    <w:p>
+      <w:pPr>
+        <w:pStyle w:val="BodyText"/>
+      </w:pPr>
+      <w:r>
+        <w:t>A new staff_id_cards table (migration 20260903120000_staff_id_cards) holds exactly one card per employee: a unique card number (MID-XXXXXXXX), an opaque verification code behind the printed QR block, a status of active / revoked / expired, an issue date and a three-year expiry, an optional photo reference and a reissue count. A card is issued automatically the moment an Employee record is created; POST /api/v1/staff-id-cards/generate back-fills a card for every active employee that still lacks one and ages out any card past its expiry; setting an employee inactive revokes the card and bringing them back re-activates it.</w:t>
+      </w:r>
+    </w:p>
+    <w:p>
+      <w:pPr>
+        <w:pStyle w:val="BodyText"/>
+      </w:pPr>
+      <w:r>
+        <w:t>A new module (src/staff-id-cards) exposes /api/v1/staff-id-cards under two new HR-domain permissions — employee.idcard.manage (issue, reissue, revoke, restore, correct the photo or expiry, run the bulk sweep) and employee.idcard.viewAll (group-wide read). It offers list / summary / get / by-employee / verify-by-code reads plus generate, issue, PATCH, reissue, revoke and restore; every mutation is audited and the feed is company-scoped per BR-01. Manage + viewAll are granted to Super Administrator, Managing Director, IT Administrator and the Human Resources Manager; manage within their own scope to the Branch Manager; viewAll to the group oversight roles.</w:t>
+      </w:r>
+    </w:p>
+    <w:p>
+      <w:pPr>
+        <w:pStyle w:val="BodyText"/>
+      </w:pPr>
+      <w:r>
+        <w:t>The staff Admin app gains a Staff ID Cards screen under Human Resources (a card-face gallery with the Morise mark, the holder's photo or initials and a QR block, plus Generate missing cards / Issue / Edit / Reissue / Revoke / Restore) and a My HR -&gt; My ID Card self-service screen (GET /api/v1/my-hr/id-card, scoped by Employee.userId). Verified end to end against the running system; nest build, admin vite build and prisma migrate deploy all clean; openapi.json regenerated (367 paths, 467 operations).</w:t>
+      </w:r>
+    </w:p>
+    <w:p>
+      <w:pPr>
+        <w:pStyle w:val="Heading2"/>
+      </w:pPr>
+      <w:r>
+        <w:t>Impact on this document</w:t>
+      </w:r>
+    </w:p>
+    <w:p>
+      <w:pPr>
+        <w:pStyle w:val="BodyText"/>
+      </w:pPr>
+      <w:r>
+        <w:t>Scope note — an administrator-facing addition: the platform now issues and maintains a controlled staff identity credential for every active administration employee automatically. Additive (one table, one module, two HR permissions, one self-service screen); no change to project scope framing, phasing, cost basis or architecture position.</w:t>
+      </w:r>
+    </w:p>
+    <w:p>
+      <w:pPr>
+        <w:pStyle w:val="Heading1"/>
+      </w:pPr>
+      <w:r>
+        <w:t>104. Implementation Status Update 91 (3 September 2026) — Staff Identification Card — Front and Back</w:t>
+      </w:r>
+    </w:p>
+    <w:p>
+      <w:pPr>
+        <w:pStyle w:val="BodyText"/>
+      </w:pPr>
+      <w:r>
+        <w:t>Following Update 90 (the automatic staff identification card), an administrator asked that the card have a distinct front and a back part rather than a single face.</w:t>
+      </w:r>
+    </w:p>
+    <w:p>
+      <w:pPr>
+        <w:pStyle w:val="BodyText"/>
+      </w:pPr>
+      <w:r>
+        <w:t>The card resource now carries a back object alongside the front fields. The front is unchanged — logo header, photo or initials, holder name / job title / staff number / company / unit, the QR block, card number and issue / expiry. The back carries the standard conditions of use, an "if found, return to" block built from the issuing company's registered address and contact, the holder's national ID and emergency contact (read live from the Employee record), an optional blood group and a free-text note (both held on the card), a Code 128-style barcode of the card number and holder / issuing-officer signature lines.</w:t>
+      </w:r>
+    </w:p>
+    <w:p>
+      <w:pPr>
+        <w:pStyle w:val="BodyText"/>
+      </w:pPr>
+      <w:r>
+        <w:t>Two card-held back fields are added — blood_group and back_notes (migration 20260903140000_staff_id_card_back) — settable on issue and via PATCH /api/v1/staff-id-cards/:id under the existing employee.idcard.manage permission; everything else on the back is derived. GET /api/v1/staff-id-cards* and GET /api/v1/my-hr/id-card all return the new back object; no new endpoint or permission.</w:t>
+      </w:r>
+    </w:p>
+    <w:p>
+      <w:pPr>
+        <w:pStyle w:val="BodyText"/>
+      </w:pPr>
+      <w:r>
+        <w:t>The shared IdCard.jsx component renders both faces — a "Show back / Show front" flip on the admin Staff ID Cards gallery, and front-and-back side by side on My HR -&gt; My ID Card. The admin Edit dialog gains Blood group and Back note fields. Verified end to end against the running system; nest build, admin vite build and prisma migrate deploy all clean; openapi.json unchanged at 367 paths / 467 operations.</w:t>
+      </w:r>
+    </w:p>
+    <w:p>
+      <w:pPr>
+        <w:pStyle w:val="Heading2"/>
+      </w:pPr>
+      <w:r>
+        <w:t>Impact on this document</w:t>
+      </w:r>
+    </w:p>
+    <w:p>
+      <w:pPr>
+        <w:pStyle w:val="BodyText"/>
+      </w:pPr>
+      <w:r>
+        <w:t>Scope note — a refinement of the Update 90 identification-card feature: the card now has a front and a back part. Additive (two nullable columns, a derived back object); no change to project scope framing, phasing, cost basis or architecture position.</w:t>
+      </w:r>
+    </w:p>
+    <w:p>
+      <w:pPr>
+        <w:pStyle w:val="Heading1"/>
+      </w:pPr>
+      <w:r>
+        <w:t>105. Implementation Status Update 92 (3 September 2026) — Staff Identification Card — Back Face Sized to the Front, Blood Group Removed</w:t>
+      </w:r>
+    </w:p>
+    <w:p>
+      <w:pPr>
+        <w:pStyle w:val="BodyText"/>
+      </w:pPr>
+      <w:r>
+        <w:t>Following Updates 90 and 91 (the automatic staff identification card, then its front and back), an administrator asked for two adjustments to the back: remove the blood group section, and make the back the same size as the front.</w:t>
+      </w:r>
+    </w:p>
+    <w:p>
+      <w:pPr>
+        <w:pStyle w:val="BodyText"/>
+      </w:pPr>
+      <w:r>
+        <w:t>The card back no longer shows a blood group. The card-held blood_group column is dropped (migration 20260903160000_staff_id_card_drop_blood_group); the free-text back_notes field is kept. The back object returned by GET /api/v1/staff-id-cards* and GET /api/v1/my-hr/id-card no longer carries bloodGroup, and POST / PATCH /api/v1/staff-id-cards/:id no longer accept it. The back still shows the holder's national ID and emergency contact (from the Employee), the conditions of use, the "if found, return to" block from the issuing company's address, an optional note and the barcode.</w:t>
+      </w:r>
+    </w:p>
+    <w:p>
+      <w:pPr>
+        <w:pStyle w:val="BodyText"/>
+      </w:pPr>
+      <w:r>
+        <w:t>Both faces are now a single fixed rectangle — the shared IdCard.jsx component renders the front and the back at the same width and height (a fixed CARD_W x CARD_H box, overflow clipped), with the back's barcode and signature lines anchored to the bottom edge. The admin Edit dialog drops the Blood group field (Photo, Expiry and Back note remain).</w:t>
+      </w:r>
+    </w:p>
+    <w:p>
+      <w:pPr>
+        <w:pStyle w:val="BodyText"/>
+      </w:pPr>
+      <w:r>
+        <w:t>No new endpoint or permission; openapi.json path / operation counts unchanged (367 / 467). Verified end to end against the running system; nest build, admin vite build and prisma migrate deploy all clean.</w:t>
+      </w:r>
+    </w:p>
+    <w:p>
+      <w:pPr>
+        <w:pStyle w:val="Heading2"/>
+      </w:pPr>
+      <w:r>
+        <w:t>Impact on this document</w:t>
+      </w:r>
+    </w:p>
+    <w:p>
+      <w:pPr>
+        <w:pStyle w:val="BodyText"/>
+      </w:pPr>
+      <w:r>
+        <w:t>Scope note — a small refinement of the Update 90-91 identification-card feature: the blood group section is removed from the back and the two faces are the same size. Removal only (one dropped column); no change to project scope framing, phasing, cost basis or architecture position.</w:t>
+      </w:r>
+    </w:p>
+    <w:p>
+      <w:pPr>
+        <w:pStyle w:val="Heading1"/>
+      </w:pPr>
+      <w:r>
+        <w:t>106. Implementation Status Update 93 (3 September 2026) — Morise Milling Ltd Subsidiary + Milling ERP Specification (New Doc 23)</w:t>
+      </w:r>
+    </w:p>
+    <w:p>
+      <w:pPr>
+        <w:pStyle w:val="BodyText"/>
+      </w:pPr>
+      <w:r>
+        <w:t>An administrator asked to add a new subsidiary under Morise Holdings Limited with a grain-milling concept, based on the client attachment "Software Development Features for a Milling Company".</w:t>
+      </w:r>
+    </w:p>
+    <w:p>
+      <w:pPr>
+        <w:pStyle w:val="BodyText"/>
+      </w:pPr>
+      <w:r>
+        <w:t>Morise Milling Ltd is seeded as a wholly-owned (100%) subsidiary (company id a1000000-0000-4000-8000-000000000007): six mill sites / branches (Kampala Head Office &amp; Central Mill, Jinja Wheat &amp; Maize Mill, Masindi Maize Mill, Mbale Millet &amp; Sorghum Mill, Lira Grain Mill &amp; Silos, Kampala Distribution Depot); twelve departments, one per architecture module (Grain Procurement &amp; Weighbridge; Warehouse &amp; Inventory; Production &amp; Milling Lines; Machine &amp; Maintenance; Quality Assurance &amp; Control; Packaging; Sales &amp; Customer Management; Distribution &amp; Delivery; Finance &amp; Accounting; Human Resources &amp; Workforce; Procurement &amp; Supplier Management; IT, IoT &amp; Integrations); and six starter policies (Weighbridge Ticket Integrity, Grain Acceptance &amp; Moisture Limits, Milling Yield &amp; Loss Tolerance, Batch Traceability End to End, Preventive Maintenance Compliance, Food Safety &amp; Product Release). Only prisma/seed.ts changes — no code, schema or permission change.</w:t>
+      </w:r>
+    </w:p>
+    <w:p>
+      <w:pPr>
+        <w:pStyle w:val="BodyText"/>
+      </w:pPr>
+      <w:r>
+        <w:t>The milling-specific system is a specification, not built. New doc 23 — Milling ERP &amp; Integrated Business Management System — Feature Specification — restates the attachment in the house format: twelve feature modules from grain procurement over a weighbridge through production and milling lines, machine maintenance, QA/QC, packaging, sales, distribution, finance and workforce to a management dashboard with IoT / PLC integration and end-to-end supplier-to-customer batch traceability; plus non-functional requirements, an architecture overview, an integration table, the fifteen recommended roles, a technology-stack table, the organisation as seeded, a five-phase delivery roadmap and a section on reuse of the existing MBMS modules.</w:t>
+      </w:r>
+    </w:p>
+    <w:p>
+      <w:pPr>
+        <w:pStyle w:val="BodyText"/>
+      </w:pPr>
+      <w:r>
+        <w:t>The storefront's public site lists Morise Milling Ltd in the Companies directory (a SUBSIDIARY_META entry, a new subsidiary-milling.svg banner in the brand family mirrored into both apps, and a News item). Group figures become six subsidiaries and twenty-six sites / branches. Verified against the running system; admin and storefront builds are clean.</w:t>
+      </w:r>
+    </w:p>
+    <w:p>
+      <w:pPr>
+        <w:pStyle w:val="Heading2"/>
+      </w:pPr>
+      <w:r>
+        <w:t>Impact on this document</w:t>
+      </w:r>
+    </w:p>
+    <w:p>
+      <w:pPr>
+        <w:pStyle w:val="BodyText"/>
+      </w:pPr>
+      <w:r>
+        <w:t>Scope note — the group gains a sixth wholly-owned operating company, Morise Milling Ltd (grain milling): its organisation is seeded and live, and its ERP is a specification and a phased backlog (new doc 23). Additive (seed data + one spec doc + a storefront listing and brand banner); no change to project scope framing, phasing, cost basis or architecture position.</w:t>
+      </w:r>
+    </w:p>
+    <w:p>
+      <w:pPr>
+        <w:pStyle w:val="Heading1"/>
+      </w:pPr>
+      <w:r>
+        <w:t>107. Implementation Status Update 94 (3 September 2026) — Automatic Morise e-Stamp on a Customer-Acknowledged Delivery</w:t>
+      </w:r>
+    </w:p>
+    <w:p>
+      <w:pPr>
+        <w:pStyle w:val="BodyText"/>
+      </w:pPr>
+      <w:r>
+        <w:t>Update 66 (recorded as a specification only) is now built: after a Morise delivery is completed, the customer confirms — through the customer portal — that they received the order's goods / services in good condition, and MBMS automatically places a Morise e-Stamp on the order's invoice.</w:t>
+      </w:r>
+    </w:p>
+    <w:p>
+      <w:pPr>
+        <w:pStyle w:val="BodyText"/>
+      </w:pPr>
+      <w:r>
+        <w:t>New endpoint POST /api/v1/customer-portal/orders/:id/delivery/acknowledge (customer JWT) with condition = good | damaged | incomplete | not_received and an optional note. It is allowed only once the order's delivery is "delivered", and only once. A "good" acknowledgement, in one transaction, stamps the order's invoice — invoices.stamped_at, a unique invoices.stamp_number = MOR-ESTAMP-YYYY-NNNNNN, invoices.stamp_condition = "good" (new nullable columns, migration 20260903180000_invoice_estamp_delivery_ack) — and logs a delivery event, an invoice.estamp.issued audit entry and a best-effort staff notification. A damaged / incomplete / not-received acknowledgement issues no stamp: it sets deliveries.exception_opened_at, logs the customer's report and raises a delivery.exception_opened audit entry and a staff notification.</w:t>
+      </w:r>
+    </w:p>
+    <w:p>
+      <w:pPr>
+        <w:pStyle w:val="BodyText"/>
+      </w:pPr>
+      <w:r>
+        <w:t>The e-Stamp is shown on the customer's delivery-tracking view, the invoice list and detail, the staff DeliveryService.get, and the downloaded invoice PDF — which now draws a navy / amber Morise seal (the Morise "M" mark, "MORISE e-STAMP", the stamp number and the confirmation wording) top-right. Storefront: a "Did everything arrive in good condition?" panel on the My Orders detail (confirm receipt / report a problem) and a "Morise e-Stamp" badge on the Invoices list. Seed adds one completed delivery for a Highland Traders order awaiting confirmation.</w:t>
+      </w:r>
+    </w:p>
+    <w:p>
+      <w:pPr>
+        <w:pStyle w:val="BodyText"/>
+      </w:pPr>
+      <w:r>
+        <w:t>Verified end to end against the running system (a "good" acknowledgement issued MOR-ESTAMP-2026-000001 on the invoice and rendered the seal on the PDF; the guards and the damaged path behaved). nest build, storefront vite build and prisma migrate deploy all clean; openapi.json regenerated (368 paths / 468 operations). Supersedes the "spec only — nothing built" status of Update 66.</w:t>
+      </w:r>
+    </w:p>
+    <w:p>
+      <w:pPr>
+        <w:pStyle w:val="Heading2"/>
+      </w:pPr>
+      <w:r>
+        <w:t>Impact on this document</w:t>
+      </w:r>
+    </w:p>
+    <w:p>
+      <w:pPr>
+        <w:pStyle w:val="BodyText"/>
+      </w:pPr>
+      <w:r>
+        <w:t>Scope note — implements a previously-recorded requirement (Update 66): the order-to-cash / delivery flow gains a customer acknowledgement step and an automatic Morise e-Stamp on the invoice. Additive (one customer-portal endpoint, three nullable invoice columns + five nullable delivery columns, one migration); no new permission; no change to project scope framing, phasing, cost basis or architecture position.</w:t>
+      </w:r>
+    </w:p>
+    <w:p>
+      <w:pPr>
+        <w:pStyle w:val="Heading1"/>
+      </w:pPr>
+      <w:r>
+        <w:t>108. Implementation Status Update 95 (3 September 2026) — A Clear "Confirm Receipt" Button / Link for the Customer e-Stamp Confirmation</w:t>
+      </w:r>
+    </w:p>
+    <w:p>
+      <w:pPr>
+        <w:pStyle w:val="BodyText"/>
+      </w:pPr>
+      <w:r>
+        <w:t>Following Update 94 (the automatic Morise e-Stamp on a customer-acknowledged delivery), an administrator asked that the customer have a clear confirmation button / link — not just a panel buried in an order's detail.</w:t>
+      </w:r>
+    </w:p>
+    <w:p>
+      <w:pPr>
+        <w:pStyle w:val="BodyText"/>
+      </w:pPr>
+      <w:r>
+        <w:t>New read GET /api/v1/customer-portal/orders/awaiting-confirmation (customer JWT) returns the customer's own orders with a completed delivery they have not yet confirmed (orderId, orderNumber, deliveryNumber, deliveredAt, companyName). The dashboard summary (GET /customer-portal/dashboard-summary) gains deliveriesToConfirm and firstDeliveryToConfirmOrderId. No schema change, no new permission.</w:t>
+      </w:r>
+    </w:p>
+    <w:p>
+      <w:pPr>
+        <w:pStyle w:val="BodyText"/>
+      </w:pPr>
+      <w:r>
+        <w:t>Storefront: a dedicated confirmation page at /orders/:id/confirm — a shareable URL that shows the order and delivery summary and a prominent "Confirm — received in good condition" button plus a "Report a problem" form; on a good confirmation it shows the Morise e-Stamp number and a "Download stamped invoice" link, on a problem the exception notice. The My Orders list marks each order awaiting confirmation with a "Confirm receipt →" link to that page, and the Home dashboard shows a prompt card ("You have N deliveries awaiting your confirmation" + "Confirm now").</w:t>
+      </w:r>
+    </w:p>
+    <w:p>
+      <w:pPr>
+        <w:pStyle w:val="BodyText"/>
+      </w:pPr>
+      <w:r>
+        <w:t>The Update 94 acknowledge endpoint, the automatic e-Stamp and the in-detail panel are unchanged. Verified end to end against the running system; nest build and storefront vite build clean; openapi.json regenerated (369 paths / 469 operations).</w:t>
+      </w:r>
+    </w:p>
+    <w:p>
+      <w:pPr>
+        <w:pStyle w:val="Heading2"/>
+      </w:pPr>
+      <w:r>
+        <w:t>Impact on this document</w:t>
+      </w:r>
+    </w:p>
+    <w:p>
+      <w:pPr>
+        <w:pStyle w:val="BodyText"/>
+      </w:pPr>
+      <w:r>
+        <w:t>Scope note — a usability follow-up to Update 94: the customer confirmation that triggers the Morise e-Stamp is now a first-class call to action (a Home prompt, an order-row link and a dedicated confirmation page). Additive (one read endpoint + two dashboard-summary fields); no schema or permission change; no change to project scope framing, phasing, cost basis or architecture position.</w:t>
+      </w:r>
+    </w:p>
+    <w:p>
+      <w:pPr>
+        <w:pStyle w:val="Heading1"/>
+      </w:pPr>
+      <w:r>
+        <w:t>109. Implementation Status Update 96 (3 September 2026) — Confirm-Receipt Button Driven by the Order's Delivered Status</w:t>
+      </w:r>
+    </w:p>
+    <w:p>
+      <w:pPr>
+        <w:pStyle w:val="BodyText"/>
+      </w:pPr>
+      <w:r>
+        <w:t>An administrator asked that the customer's "Confirm receipt" button be driven by the order's status: once admin staff mark the order delivered, the button appears in My Orders, and the customer clicks it to attest the goods / services arrived in good condition — which is what generates the automatic Morise e-Stamp. A Morise Logistics delivery record is no longer required.</w:t>
+      </w:r>
+    </w:p>
+    <w:p>
+      <w:pPr>
+        <w:pStyle w:val="BodyText"/>
+      </w:pPr>
+      <w:r>
+        <w:t>The Order gains delivered_at (stamped when an administrator advances the order to "delivered", or a Morise Logistics delivery completes) and customer_receipt_confirmed_at / customer_receipt_condition / customer_receipt_note (migration 20260903200000_order_customer_receipt, which back-fills delivered_at for orders already delivered). GET /api/v1/customer-portal/orders and .../:id now return deliveredAt, the receipt fields and canConfirmReceipt (order.status = "delivered" and not yet confirmed), plus eStamped / stampNumber on the invoice sub-object.</w:t>
+      </w:r>
+    </w:p>
+    <w:p>
+      <w:pPr>
+        <w:pStyle w:val="BodyText"/>
+      </w:pPr>
+      <w:r>
+        <w:t>POST /api/v1/customer-portal/orders/:id/delivery/acknowledge is now order-driven: allowed once the order is "delivered" and only once, regardless of whether a delivery record exists. A "good" confirmation records the receipt on the order and auto-stamps the order's invoice (MOR-ESTAMP-YYYY-NNNNNN); any other condition records a dispute (no stamp). When a Morise Logistics delivery record exists, the confirmation is mirrored onto it. Audited as invoice.estamp.issued (good) or order.receipt.disputed (else) with a best-effort staff notification. awaiting-confirmation and the dashboard summary's deliveriesToConfirm now count delivered, unconfirmed orders.</w:t>
+      </w:r>
+    </w:p>
+    <w:p>
+      <w:pPr>
+        <w:pStyle w:val="BodyText"/>
+      </w:pPr>
+      <w:r>
+        <w:t>Storefront: the My Orders detail panel, the /orders/:id/confirm page and the "Confirm receipt →" row link are all driven by the order's delivered status and no longer need a delivery record. Verified end to end against the running system; nest build, storefront vite build and prisma migrate deploy all clean; openapi.json unchanged at 369 paths / 469 operations.</w:t>
+      </w:r>
+    </w:p>
+    <w:p>
+      <w:pPr>
+        <w:pStyle w:val="Heading2"/>
+      </w:pPr>
+      <w:r>
+        <w:t>Impact on this document</w:t>
+      </w:r>
+    </w:p>
+    <w:p>
+      <w:pPr>
+        <w:pStyle w:val="BodyText"/>
+      </w:pPr>
+      <w:r>
+        <w:t>Scope note — refinement of Updates 94-95: the customer confirmation that generates the Morise e-Stamp is now tied to the order's delivered status set by admin staff, and works for any delivered order. Additive (four nullable Order columns, one migration); no new endpoint or permission; no change to project scope framing, phasing, cost basis or architecture position.</w:t>
+      </w:r>
+    </w:p>
+    <w:p>
+      <w:pPr>
+        <w:pStyle w:val="Heading1"/>
+      </w:pPr>
+      <w:r>
+        <w:t>110. Implementation Status Update 97 (3 September 2026) — Social Media Publishing — Composer, Publishing Engine &amp; Status Dashboard (New Doc 24)</w:t>
+      </w:r>
+    </w:p>
+    <w:p>
+      <w:pPr>
+        <w:pStyle w:val="BodyText"/>
+      </w:pPr>
+      <w:r>
+        <w:t>An administrator asked for a mini Buffer / Hootsuite inside MBMS: write one master post, fan it out to many social media channels in one click with per-platform caption overrides, publish now or schedule, and see per-platform success / failure. The architecture plan the administrator supplied is restated in the house format in the new doc 24.</w:t>
+      </w:r>
+    </w:p>
+    <w:p>
+      <w:pPr>
+        <w:pStyle w:val="BodyText"/>
+      </w:pPr>
+      <w:r>
+        <w:t>A new module (src/social-publishing) exposes /api/v1/social. Schema (migration 20260903220000_social_publishing): social_connections (a simulated OAuth connection per platform — status, account label, a ~60-day token expiry, a placeholder token reference; no real handshake), social_posts (master body, media type + text-reference url, link, status, scheduledFor) and social_post_targets (one row per platform per post — caption override, status, external id + permalink, error, attempts). Three new governance-domain permissions: social.post.manage, social.post.publish and social.post.viewAll — the "can create drafts vs can publish" split.</w:t>
+      </w:r>
+    </w:p>
+    <w:p>
+      <w:pPr>
+        <w:pStyle w:val="BodyText"/>
+      </w:pPr>
+      <w:r>
+        <w:t>Endpoints: GET /social/platforms; POST /social/platforms/:platform/{connect,disconnect}; GET / POST /social/posts, GET / PATCH / DELETE /social/posts/:id (get returns a per-platform preview); POST /social/posts/:id/publish (the single button), POST /social/posts/:id/retry, POST /social/run-scheduled; GET /social/dashboard. Every mutation is audited.</w:t>
+      </w:r>
+    </w:p>
+    <w:p>
+      <w:pPr>
+        <w:pStyle w:val="BodyText"/>
+      </w:pPr>
+      <w:r>
+        <w:t>The publish itself is SIMULATED — no OAuth handshake, platform API call or job queue exists in this build (the same deferred external integration recorded for Kafka, object storage and email / SMS); the connection / post / target / partial-failure / retry / dashboard shape is real. Admin gains a Social Publishing screen under ADMIN / BACKEND (four tabs). Verified end to end against the running system; nest build, admin vite build and prisma migrate deploy all clean; openapi.json regenerated (378 paths / 481 operations).</w:t>
+      </w:r>
+    </w:p>
+    <w:p>
+      <w:pPr>
+        <w:pStyle w:val="Heading2"/>
+      </w:pPr>
+      <w:r>
+        <w:t>Impact on this document</w:t>
+      </w:r>
+    </w:p>
+    <w:p>
+      <w:pPr>
+        <w:pStyle w:val="BodyText"/>
+      </w:pPr>
+      <w:r>
+        <w:t>Scope note — a new core feature area (group social media publishing) and a new specification document (doc 24). Additive (one module, three tables, three governance permissions, one admin screen); the live platform integration is a documented deferral; no change to project scope framing, phasing, cost basis or architecture position.</w:t>
+      </w:r>
+    </w:p>
+    <w:p>
+      <w:pPr>
+        <w:pStyle w:val="Heading1"/>
+      </w:pPr>
+      <w:r>
+        <w:t>111. Implementation Status Update 98 (8 September 2026) — Product Catalogue for Morise Milling Ltd + Branch-Tagged Product Registration (Doc 23)</w:t>
+      </w:r>
+    </w:p>
+    <w:p>
+      <w:pPr>
+        <w:pStyle w:val="BodyText"/>
+      </w:pPr>
+      <w:r>
+        <w:t>An administrator asked to add products to Morise Milling Ltd. Morise Milling Ltd was seeded as the group's sixth wholly-owned subsidiary in Update 93 (3 September 2026) with six mill sites and twelve departments but zero products — it was spec-stage only. This update gives it its first product catalogue and, at the same time, generalises product registration in the Admin app so any multi-site subsidiary's products can be tagged to the branch/site that produces them, not just company-wide.</w:t>
+      </w:r>
+    </w:p>
+    <w:p>
+      <w:pPr>
+        <w:pStyle w:val="BodyText"/>
+      </w:pPr>
+      <w:r>
+        <w:t>prisma/seed.ts gains a Morise Milling Ltd product-catalogue block (ensureMillProduct helper, 7 new categories): 24 SKUs — 15 priced finished goods and services (maize, wheat, and millet/sorghum flour lines across 4 pack sizes; maize bran, wheat bran/pollard, maize germ and a compounded dairy meal as by-products; toll milling, grain cleaning/drying, silo storage and grain grading/moisture testing as services) plus 4 internal-only items (raw maize/wheat/millet grain intake, printed bag and retail-pack packaging) that are seeded with no unitPrice on purpose — CustomerCatalogService only lists priced products, so raw materials and packaging stay off the customer storefront while Admin Inventory still tracks them. Batch tracking (trackBatches) and min/max stock levels are set per docx/23 section 2.2 (raw-material / finished-goods / packaging warehouses, FIFO-FEFO, min-max levels) and sections 2.5-2.6 (batch numbers, expiry / best-before, end-to-end batch traceability). Each item is attributed to the mill or depot that produces or holds it.</w:t>
+      </w:r>
+    </w:p>
+    <w:p>
+      <w:pPr>
+        <w:pStyle w:val="BodyText"/>
+      </w:pPr>
+      <w:r>
+        <w:t>Product.branchId already existed on the schema (29 August 2026, storefront group catalogue), but only the seed could set it — a product registered through the Admin screen was always company-wide. CreateProductDto and UpdateProductDto both gain an optional branchId; ProductsService.assertReferencesBelongTo validates on create and update that both the category and the branch belong to the product's own companyId, and every product read now returns companyName and branchName.</w:t>
+      </w:r>
+    </w:p>
+    <w:p>
+      <w:pPr>
+        <w:pStyle w:val="BodyText"/>
+      </w:pPr>
+      <w:r>
+        <w:t>The Admin Products screen is rebuilt on top of this: a subsidiary filter above the list, Company / Branch / Category / Stock columns and a per-row Edit action added to the table, and the New Product form replaced with Company and Branch dropdowns (previously a bare company-UUID text field). A new Edit Product modal exposes the PATCH /products/:id endpoint (it has existed since Sprint 4 with no screen). Verified end to end: reseeded and confirmed all 24 Morise Milling Ltd rows in Postgres with correct branch attribution; nest build clean; openapi.json regenerated (378 paths / 481 operations / 188 schemas — unchanged, no new path). The group catalogue is now 58 products across 25 categories (53 storefront-priced, 5 internal-only), and all six operating subsidiaries sell at least one product or service.</w:t>
+      </w:r>
+    </w:p>
+    <w:p>
+      <w:pPr>
+        <w:pStyle w:val="Heading2"/>
+      </w:pPr>
+      <w:r>
+        <w:t>Impact on this document</w:t>
+      </w:r>
+    </w:p>
+    <w:p>
+      <w:pPr>
+        <w:pStyle w:val="BodyText"/>
+      </w:pPr>
+      <w:r>
+        <w:t>Scope note — Morise Milling Ltd moves from a specification-only subsidiary to a selling one, and product registration is generalised to be branch-aware everywhere, not just in seed data. Additive (one seed block, two DTO fields, one service method, one screen rebuild); no change to project scope framing, phasing, cost basis or architecture position.</w:t>
+      </w:r>
+    </w:p>
+    <w:p>
+      <w:pPr>
+        <w:pStyle w:val="Heading1"/>
+      </w:pPr>
+      <w:r>
+        <w:t>112. Implementation Status Update 99 (9 September 2026) — Morise Research &amp; Consultancy Ltd — Seventh Subsidiary + RC-MIS Specification (New Doc 25)</w:t>
+      </w:r>
+    </w:p>
+    <w:p>
+      <w:pPr>
+        <w:pStyle w:val="BodyText"/>
+      </w:pPr>
+      <w:r>
+        <w:t>An administrator asked to add a subsidiary for research and other types of consultancy, based on the client attachment docx/Research_and_Consultancy_Software_Development_Features.docx. Morise Research &amp; Consultancy Ltd is seeded as the group's seventh wholly-owned (100%) subsidiary (company id a1000000-0000-4000-8000-000000000008), registered at Plot 7, Acacia Avenue, Kololo, Kampala, currency UGX, financial year starting 1 January 2026 — created and managed by the Managing Director under the existing subsidiary-lifecycle capability (Update 34), the same way as every prior subsidiary.</w:t>
+      </w:r>
+    </w:p>
+    <w:p>
+      <w:pPr>
+        <w:pStyle w:val="BodyText"/>
+      </w:pPr>
+      <w:r>
+        <w:t>Five sites/branches (ids b1...0050-0054): Kampala Head Office, and four regional field offices — Gulu (Northern), Mbale (Eastern), Mbarara (Western) and a Karamoja Field Station (Moroto) — reflecting the client attachment's emphasis on geographic coverage and target-population reach for fieldwork. Twelve departments (ids d1...0080-0091) condense the client's fourteen-node RC-MIS architecture into standing organisational units: Client &amp; Business Development; Contracts &amp; Grants Management; Research Design &amp; Methodology; Field Operations &amp; Data Collection; Data Quality &amp; Management; Data Analysis &amp; Qualitative Research; Monitoring &amp; Evaluation; Reports, Deliverables &amp; Knowledge Management; Ethics &amp; Compliance; Finance, Procurement &amp; Subcontracting; Human Resources &amp; Consultant Management; IT, Client Portal &amp; Systems. Six starter policies (ids p1...0050-0055): Research Ethics &amp; Informed Consent, Data Protection &amp; Participant Confidentiality, Fieldwork Safety &amp; Security, Data Quality Assurance, Consultant &amp; Enumerator Conflict of Interest, and Contract, Grant &amp; Proposal Compliance.</w:t>
+      </w:r>
+    </w:p>
+    <w:p>
+      <w:pPr>
+        <w:pStyle w:val="BodyText"/>
+      </w:pPr>
+      <w:r>
+        <w:t>Like every subsidiary before its first feature build, only the organisation is seeded — seed.ts only, no code, schema or permission change. The subsidiary is not a storefront seller (0 products); a research and consultancy firm is billed on contracts, retainers and timesheets, not a priced catalogue. The RC-MIS itself (fourteen modules) is a specification, not built: new docx/25 restates the client attachment in the house documentation format used for docs 19-24, covering the fourteen modules, non-functional requirements, architecture, key integration points, user roles, suggested technology stack, the organisation as built, a five-phase delivery roadmap, and how it would relate to and reuse the existing MBMS platform.</w:t>
+      </w:r>
+    </w:p>
+    <w:p>
+      <w:pPr>
+        <w:pStyle w:val="BodyText"/>
+      </w:pPr>
+      <w:r>
+        <w:t>The storefront's corporate site picks up the new subsidiary automatically from GET /customer-portal/public/overview (group now 7 subsidiaries, 31 sites/branches); corporate.js gains a SUBSIDIARY_META entry, a SUBSIDIARY_BANNER entry and a News item for it. A new brand/banners/subsidiary-research-consultancy.svg (indigo accent; bar-chart-and-magnifying-glass motif) is mirrored into both apps' public/brand/banners/ and added to brand/README.md's banner table. Verified end to end against the running system: the new company, its 5 branches, 12 departments and 6 policies confirmed in Postgres and via the authenticated Admin organisation API; the public overview endpoint lists it with its branch count; both banner assets resolve on the Admin app and the Customer Storefront. No new endpoint, migration or permission; openapi.json unchanged.</w:t>
+      </w:r>
+    </w:p>
+    <w:p>
+      <w:pPr>
+        <w:pStyle w:val="Heading2"/>
+      </w:pPr>
+      <w:r>
+        <w:t>Impact on this document</w:t>
+      </w:r>
+    </w:p>
+    <w:p>
+      <w:pPr>
+        <w:pStyle w:val="BodyText"/>
+      </w:pPr>
+      <w:r>
+        <w:t>Scope note — the group's seventh subsidiary and first in the research/consultancy sector, added the same low-footprint way as every prior spec-stage subsidiary (organisation seeded, feature system documented as a specification). Additive only; no change to project scope framing, phasing, cost basis or architecture position.</w:t>
+      </w:r>
+    </w:p>
+    <w:p>
+      <w:pPr>
+        <w:pStyle w:val="Heading1"/>
+      </w:pPr>
+      <w:r>
+        <w:t>113. Implementation Status Update 100 (9 September 2026) — Services Catalogue for Morise Research &amp; Consultancy Ltd (Doc 25)</w:t>
+      </w:r>
+    </w:p>
+    <w:p>
+      <w:pPr>
+        <w:pStyle w:val="BodyText"/>
+      </w:pPr>
+      <w:r>
+        <w:t>An administrator asked to add products to Morise Research &amp; Consultancy Ltd. Morise Research &amp; Consultancy Ltd was seeded as the group's seventh subsidiary in Update 99 (9 September 2026) with five field offices and twelve departments but zero products — spec-stage only, on the reasoning that a consultancy is billed on contracts and timesheets. Like Morise Collateral Management Ltd (Update 60), which is also billed on contracts and retainers, the subsidiary can still carry a priced services catalogue representing its standard, quotable engagements; this update seeds that first catalogue.</w:t>
+      </w:r>
+    </w:p>
+    <w:p>
+      <w:pPr>
+        <w:pStyle w:val="BodyText"/>
+      </w:pPr>
+      <w:r>
+        <w:t>prisma/seed.ts gains a Morise Research &amp; Consultancy Ltd services block (reusing the ensureService() helper already used for the Collateral Management catalogue): 23 services (RC-7001 through RC-7051) across 6 new categories — Research &amp; Evaluation Studies, Field Data Collection, Data Management &amp; Analysis, Monitoring &amp; Evaluation Services, Technical &amp; Policy Consultancy, and Training &amp; Capacity Building. Every line is productType 'service', priced in UGX per the standard unit a client's statement of work would quote against, and every line carries a unitPrice, so the whole catalogue is storefront-visible (unlike Morise Milling Ltd's internal raw-material items).</w:t>
+      </w:r>
+    </w:p>
+    <w:p>
+      <w:pPr>
+        <w:pStyle w:val="BodyText"/>
+      </w:pPr>
+      <w:r>
+        <w:t>Each service is attributed to the office best placed to deliver it: study design, analysis, policy advisory and the day-rate line sit at the Kampala Head Office; fieldwork-heavy lines are spread across the Gulu, Mbale, Mbarara and Karamoja field offices. No schema, code or permission change — seed.ts only, reusing the existing ensureService()/ensureCategory() helpers exactly as every prior services catalogue did.</w:t>
+      </w:r>
+    </w:p>
+    <w:p>
+      <w:pPr>
+        <w:pStyle w:val="BodyText"/>
+      </w:pPr>
+      <w:r>
+        <w:t>Verified end to end against the running system: reseeded, all 23 rows confirmed in Postgres with correct branch and category attribution; the Admin Products screen, filtered to Morise Research &amp; Consultancy Ltd, lists all 23 services with correct company/branch/category/price/stock columns (screenshot-verified, no console errors); nest build clean; openapi.json regenerated byte-identical (378 paths / 481 operations / 188 schemas). Group catalogue now 81 products across 31 categories (76 storefront-priced, 5 internal-only); all seven operating subsidiaries now sell at least one product or service.</w:t>
+      </w:r>
+    </w:p>
+    <w:p>
+      <w:pPr>
+        <w:pStyle w:val="Heading2"/>
+      </w:pPr>
+      <w:r>
+        <w:t>Impact on this document</w:t>
+      </w:r>
+    </w:p>
+    <w:p>
+      <w:pPr>
+        <w:pStyle w:val="BodyText"/>
+      </w:pPr>
+      <w:r>
+        <w:t>Scope note — the group's seventh subsidiary moves from a specification-only presence to a selling one, the same way Milling and Collateral Management did before it. Additive only (one seed block reusing existing helpers); no change to project scope framing, phasing, cost basis or architecture position.</w:t>
+      </w:r>
+    </w:p>
+    <w:p>
+      <w:pPr>
+        <w:pStyle w:val="Heading1"/>
+      </w:pPr>
+      <w:r>
+        <w:t>114. Implementation Status Update 101 (9 September 2026) — Dockerized Backend, Admin App and Customer Storefront</w:t>
+      </w:r>
+    </w:p>
+    <w:p>
+      <w:pPr>
+        <w:pStyle w:val="BodyText"/>
+      </w:pPr>
+      <w:r>
+        <w:t>An administrator asked to dockerize the backend, the Admin app and the Customer Storefront. Until now only Postgres and Redis ran as containers (mbms/docker-compose.yml); the three application services ran natively. This update adds a Dockerfile for each of the three, wires them into docker-compose.yml alongside Postgres and Redis, and verifies the whole stack end to end.</w:t>
+      </w:r>
+    </w:p>
+    <w:p>
+      <w:pPr>
+        <w:pStyle w:val="BodyText"/>
+      </w:pPr>
+      <w:r>
+        <w:t>backend/Dockerfile is a two-stage build on node:20-bookworm-slim (deliberately not Alpine) for both stages: npm ci, prisma generate, then npm run build — which runs nest build, not a bare tsc, so the @nestjs/swagger CLI plugin still populates the OpenAPI document's schemas exactly as it does outside Docker. The runtime stage copies over only the compiled dist/, the already-generated Prisma Client, and production node_modules, then runs node dist/main.js. Both stages install openssl and ca-certificates explicitly — Prisma's own documented fix for a libssl-detection warning on the bare -slim image. Using the same glibc-based Debian image for both stages avoids the well-known "Query Engine could not be found" failure that mixing an Alpine build with a glibc runtime can cause.</w:t>
+      </w:r>
+    </w:p>
+    <w:p>
+      <w:pPr>
+        <w:pStyle w:val="BodyText"/>
+      </w:pPr>
+      <w:r>
+        <w:t>frontend/Dockerfile and storefront/Dockerfile follow a matching two-stage pattern on node:20-alpine (build) and nginx:1.27-alpine (runtime): npm run build produces a static Vite bundle, and a bundled nginx.conf reverse-proxies /api/* to the backend container by its Compose service name — the same relationship vite.config.js's dev-server proxy gives each app locally, so no code change and no CORS configuration are needed either way.</w:t>
+      </w:r>
+    </w:p>
+    <w:p>
+      <w:pPr>
+        <w:pStyle w:val="BodyText"/>
+      </w:pPr>
+      <w:r>
+        <w:t>docker-compose.yml gains backend, frontend and storefront services: backend waits on a new Postgres healthcheck before starting and gets its DATABASE_URL/PORT overridden to the in-network Postgres host; frontend and storefront are exposed on the same host ports their Vite dev servers already used (5173 / 5174). Migrations and seeding are still run from the host, unchanged from before the backend itself was containerized.</w:t>
+      </w:r>
+    </w:p>
+    <w:p>
+      <w:pPr>
+        <w:pStyle w:val="BodyText"/>
+      </w:pPr>
+      <w:r>
+        <w:t>Verified end to end: all three images build clean; docker compose up -d --build brings up all five containers healthy; existing seeded data survived a Postgres container recreate (lives in the mbms_pg_data named volume); a staff login and a storefront page load both succeeded through the nginx-to-backend proxy with zero console errors. No schema, endpoint or permission change; openapi.json unchanged.</w:t>
+      </w:r>
+    </w:p>
+    <w:p>
+      <w:pPr>
+        <w:pStyle w:val="Heading2"/>
+      </w:pPr>
+      <w:r>
+        <w:t>Impact on this document</w:t>
+      </w:r>
+    </w:p>
+    <w:p>
+      <w:pPr>
+        <w:pStyle w:val="BodyText"/>
+      </w:pPr>
+      <w:r>
+        <w:t>Scope note — a deployment-mechanics change (containerizing three already-working services), not a new feature. Additive only; no change to project scope framing, phasing, cost basis or architecture position.</w:t>
       </w:r>
     </w:p>
     <w:sectPr>

</xml_diff>